<commit_message>
Sensormanager EN/NL: Alt-Texte übersetzt, NL-Review-Fixes (stutpunt→steunpunt, Isolijnen glad maken, meetpuntinstallaties)
</commit_message>
<xml_diff>
--- a/Sensormanager/Anleitung/EN/TerraTransfer_Sensormanager_User-Manual_EN.docx
+++ b/Sensormanager/Anleitung/EN/TerraTransfer_Sensormanager_User-Manual_EN.docx
@@ -2147,7 +2147,7 @@
           <wp:inline distT="0" distB="0" distL="0" distR="0">
             <wp:extent cx="5029200" cy="2266950"/>
             <wp:effectExtent t="0" r="0" b="0" l="0"/>
-            <wp:docPr id="1" name="fig01_portal_overview.png" descr="Abbildung 1: Startansicht des Onlineportals mit Sensornetzwerk (links) und Statusmonitor (rechts)." title="Abbildung 1: Startansicht des Onlineportals mit Sensornetzwerk (links) und Statusmonitor (rechts)."/>
+            <wp:docPr id="1" name="fig01_portal_overview.png" descr="Figure 1: Start view of the online portal with sensor network (left) and status monitor (right)." title="Figure 1: Start view of the online portal with sensor network (left) and status monitor (right)."/>
             <wp:cNvGraphicFramePr>
               <a:graphicFrameLocks xmlns:a="http://schemas.openxmlformats.org/drawingml/2006/main" noChangeAspect="1"/>
             </wp:cNvGraphicFramePr>
@@ -2319,7 +2319,7 @@
           <wp:inline distT="0" distB="0" distL="0" distR="0">
             <wp:extent cx="5029200" cy="2486025"/>
             <wp:effectExtent t="0" r="0" b="0" l="0"/>
-            <wp:docPr id="1" name="fig02_statusmonitor.png" descr="Abbildung 2: Statusmonitor mit Ampeldarstellung der wichtigsten Kennwerte." title="Abbildung 2: Statusmonitor mit Ampeldarstellung der wichtigsten Kennwerte."/>
+            <wp:docPr id="1" name="fig02_statusmonitor.png" descr="Figure 2: Status monitor with traffic-light display of the most important metrics." title="Figure 2: Status monitor with traffic-light display of the most important metrics."/>
             <wp:cNvGraphicFramePr>
               <a:graphicFrameLocks xmlns:a="http://schemas.openxmlformats.org/drawingml/2006/main" noChangeAspect="1"/>
             </wp:cNvGraphicFramePr>
@@ -2568,7 +2568,7 @@
           <wp:inline distT="0" distB="0" distL="0" distR="0">
             <wp:extent cx="4114800" cy="3057525"/>
             <wp:effectExtent t="0" r="0" b="0" l="0"/>
-            <wp:docPr id="1" name="fig03_loggerstatus.png" descr="Abbildung 3: Loggerstatus-Dialog mit Importmeldungen." title="Abbildung 3: Loggerstatus-Dialog mit Importmeldungen."/>
+            <wp:docPr id="1" name="fig03_loggerstatus.png" descr="Figure 3: Logger-status dialogue with import messages." title="Figure 3: Logger-status dialogue with import messages."/>
             <wp:cNvGraphicFramePr>
               <a:graphicFrameLocks xmlns:a="http://schemas.openxmlformats.org/drawingml/2006/main" noChangeAspect="1"/>
             </wp:cNvGraphicFramePr>
@@ -2906,7 +2906,7 @@
           <wp:inline distT="0" distB="0" distL="0" distR="0">
             <wp:extent cx="5029200" cy="2276475"/>
             <wp:effectExtent t="0" r="0" b="0" l="0"/>
-            <wp:docPr id="1" name="fig04_sensornetzwerk.png" descr="Abbildung 4: Sensornetzwerk mit aufgeklappten Sensorkanälen eines Loggers." title="Abbildung 4: Sensornetzwerk mit aufgeklappten Sensorkanälen eines Loggers."/>
+            <wp:docPr id="1" name="fig04_sensornetzwerk.png" descr="Figure 4: Sensor network with expanded sensor channels of a logger." title="Figure 4: Sensor network with expanded sensor channels of a logger."/>
             <wp:cNvGraphicFramePr>
               <a:graphicFrameLocks xmlns:a="http://schemas.openxmlformats.org/drawingml/2006/main" noChangeAspect="1"/>
             </wp:cNvGraphicFramePr>
@@ -3105,7 +3105,7 @@
           <wp:inline distT="0" distB="0" distL="0" distR="0">
             <wp:extent cx="5029200" cy="2266950"/>
             <wp:effectExtent t="0" r="0" b="0" l="0"/>
-            <wp:docPr id="1" name="fig05_diagramm.png" descr="Abbildung 5: Diagrammansicht mit Zeitraumauswahl und Messwerttabelle." title="Abbildung 5: Diagrammansicht mit Zeitraumauswahl und Messwerttabelle."/>
+            <wp:docPr id="1" name="fig05_diagramm.png" descr="Figure 5: Chart view with time-range selection and measured-value table." title="Figure 5: Chart view with time-range selection and measured-value table."/>
             <wp:cNvGraphicFramePr>
               <a:graphicFrameLocks xmlns:a="http://schemas.openxmlformats.org/drawingml/2006/main" noChangeAspect="1"/>
             </wp:cNvGraphicFramePr>
@@ -3202,7 +3202,7 @@
           <wp:inline distT="0" distB="0" distL="0" distR="0">
             <wp:extent cx="3838575" cy="2638425"/>
             <wp:effectExtent t="0" r="0" b="0" l="0"/>
-            <wp:docPr id="1" name="fig06_niedrel.png" descr="Abbildung 6: Darstellung relativer Niederschlag mit zusätzlicher Zeitraumauswahl." title="Abbildung 6: Darstellung relativer Niederschlag mit zusätzlicher Zeitraumauswahl."/>
+            <wp:docPr id="1" name="fig06_niedrel.png" descr="Figure 6: Relative-precipitation display with additional time-range selection." title="Figure 6: Relative-precipitation display with additional time-range selection."/>
             <wp:cNvGraphicFramePr>
               <a:graphicFrameLocks xmlns:a="http://schemas.openxmlformats.org/drawingml/2006/main" noChangeAspect="1"/>
             </wp:cNvGraphicFramePr>
@@ -3375,7 +3375,7 @@
           <wp:inline distT="0" distB="0" distL="0" distR="0">
             <wp:extent cx="5029200" cy="2266950"/>
             <wp:effectExtent t="0" r="0" b="0" l="0"/>
-            <wp:docPr id="1" name="fig07_optionen.png" descr="Abbildung 7: Diagramm-Optionen aufrufen." title="Abbildung 7: Diagramm-Optionen aufrufen."/>
+            <wp:docPr id="1" name="fig07_optionen.png" descr="Figure 7: Opening the chart options." title="Figure 7: Opening the chart options."/>
             <wp:cNvGraphicFramePr>
               <a:graphicFrameLocks xmlns:a="http://schemas.openxmlformats.org/drawingml/2006/main" noChangeAspect="1"/>
             </wp:cNvGraphicFramePr>
@@ -3472,7 +3472,7 @@
           <wp:inline distT="0" distB="0" distL="0" distR="0">
             <wp:extent cx="5029200" cy="2638425"/>
             <wp:effectExtent t="0" r="0" b="0" l="0"/>
-            <wp:docPr id="1" name="fig08_mehrfach.png" descr="Abbildung 8: Mehrfache Darstellung verschiedener Sensoren in einem Diagramm." title="Abbildung 8: Mehrfache Darstellung verschiedener Sensoren in einem Diagramm."/>
+            <wp:docPr id="1" name="fig08_mehrfach.png" descr="Figure 8: Multiple sensors displayed in one chart." title="Figure 8: Multiple sensors displayed in one chart."/>
             <wp:cNvGraphicFramePr>
               <a:graphicFrameLocks xmlns:a="http://schemas.openxmlformats.org/drawingml/2006/main" noChangeAspect="1"/>
             </wp:cNvGraphicFramePr>
@@ -3569,7 +3569,7 @@
           <wp:inline distT="0" distB="0" distL="0" distR="0">
             <wp:extent cx="5029200" cy="2971800"/>
             <wp:effectExtent t="0" r="0" b="0" l="0"/>
-            <wp:docPr id="1" name="fig09_modular.png" descr="Abbildung 9: Modulare Darstellung – mehrere Diagramme nebeneinander." title="Abbildung 9: Modulare Darstellung – mehrere Diagramme nebeneinander."/>
+            <wp:docPr id="1" name="fig09_modular.png" descr="Figure 9: Modular layout – several charts side by side." title="Figure 9: Modular layout – several charts side by side."/>
             <wp:cNvGraphicFramePr>
               <a:graphicFrameLocks xmlns:a="http://schemas.openxmlformats.org/drawingml/2006/main" noChangeAspect="1"/>
             </wp:cNvGraphicFramePr>
@@ -3666,7 +3666,7 @@
           <wp:inline distT="0" distB="0" distL="0" distR="0">
             <wp:extent cx="5029200" cy="2895600"/>
             <wp:effectExtent t="0" r="0" b="0" l="0"/>
-            <wp:docPr id="1" name="fig10_zoom.png" descr="Abbildung 10: Zoomfunktionalität im Diagramm." title="Abbildung 10: Zoomfunktionalität im Diagramm."/>
+            <wp:docPr id="1" name="fig10_zoom.png" descr="Figure 10: Zoom functionality in the chart." title="Figure 10: Zoom functionality in the chart."/>
             <wp:cNvGraphicFramePr>
               <a:graphicFrameLocks xmlns:a="http://schemas.openxmlformats.org/drawingml/2006/main" noChangeAspect="1"/>
             </wp:cNvGraphicFramePr>
@@ -3831,7 +3831,7 @@
           <wp:inline distT="0" distB="0" distL="0" distR="0">
             <wp:extent cx="5029200" cy="2733675"/>
             <wp:effectExtent t="0" r="0" b="0" l="0"/>
-            <wp:docPr id="1" name="fig11_schwellen.png" descr="Abbildung 11: Visuelle Darstellung der Ereignisschwellen im Diagramm." title="Abbildung 11: Visuelle Darstellung der Ereignisschwellen im Diagramm."/>
+            <wp:docPr id="1" name="fig11_schwellen.png" descr="Figure 11: Visual display of event thresholds in the chart." title="Figure 11: Visual display of event thresholds in the chart."/>
             <wp:cNvGraphicFramePr>
               <a:graphicFrameLocks xmlns:a="http://schemas.openxmlformats.org/drawingml/2006/main" noChangeAspect="1"/>
             </wp:cNvGraphicFramePr>
@@ -3957,7 +3957,7 @@
           <wp:inline distT="0" distB="0" distL="0" distR="0">
             <wp:extent cx="3200400" cy="2276475"/>
             <wp:effectExtent t="0" r="0" b="0" l="0"/>
-            <wp:docPr id="1" name="fig12_farbe.png" descr="Abbildung 12: Farbauswahl für einen Sensor." title="Abbildung 12: Farbauswahl für einen Sensor."/>
+            <wp:docPr id="1" name="fig12_farbe.png" descr="Figure 12: Colour selection for a sensor." title="Figure 12: Colour selection for a sensor."/>
             <wp:cNvGraphicFramePr>
               <a:graphicFrameLocks xmlns:a="http://schemas.openxmlformats.org/drawingml/2006/main" noChangeAspect="1"/>
             </wp:cNvGraphicFramePr>
@@ -4968,7 +4968,7 @@
           <wp:inline distT="0" distB="0" distL="0" distR="0">
             <wp:extent cx="5029200" cy="1800225"/>
             <wp:effectExtent t="0" r="0" b="0" l="0"/>
-            <wp:docPr id="1" name="fig13_import.png" descr="Abbildung 13: Import-Dialog für Rohdaten (G2D-Dateien)." title="Abbildung 13: Import-Dialog für Rohdaten (G2D-Dateien)."/>
+            <wp:docPr id="1" name="fig13_import.png" descr="Figure 13: Import dialogue for raw data (G2D files)." title="Figure 13: Import dialogue for raw data (G2D files)."/>
             <wp:cNvGraphicFramePr>
               <a:graphicFrameLocks xmlns:a="http://schemas.openxmlformats.org/drawingml/2006/main" noChangeAspect="1"/>
             </wp:cNvGraphicFramePr>
@@ -5108,7 +5108,7 @@
           <wp:inline distT="0" distB="0" distL="0" distR="0">
             <wp:extent cx="3657600" cy="1895475"/>
             <wp:effectExtent t="0" r="0" b="0" l="0"/>
-            <wp:docPr id="1" name="fig14_bearbeiten.png" descr="Abbildung 14: Dialog zum Bearbeiten mehrerer Messwerte mit Additions-/Subtraktionsfaktor." title="Abbildung 14: Dialog zum Bearbeiten mehrerer Messwerte mit Additions-/Subtraktionsfaktor."/>
+            <wp:docPr id="1" name="fig14_bearbeiten.png" descr="Figure 14: Dialogue for editing several measured values with an addition/subtraction factor." title="Figure 14: Dialogue for editing several measured values with an addition/subtraction factor."/>
             <wp:cNvGraphicFramePr>
               <a:graphicFrameLocks xmlns:a="http://schemas.openxmlformats.org/drawingml/2006/main" noChangeAspect="1"/>
             </wp:cNvGraphicFramePr>
@@ -5401,7 +5401,7 @@
           <wp:inline distT="0" distB="0" distL="0" distR="0">
             <wp:extent cx="5029200" cy="3086100"/>
             <wp:effectExtent t="0" r="0" b="0" l="0"/>
-            <wp:docPr id="1" name="fig15_dokumente.png" descr="Abbildung 15: Schematischer Messstellenplan im Dokumentenmanagement." title="Abbildung 15: Schematischer Messstellenplan im Dokumentenmanagement."/>
+            <wp:docPr id="1" name="fig15_dokumente.png" descr="Figure 15: Schematic measuring-point plan in document management." title="Figure 15: Schematic measuring-point plan in document management."/>
             <wp:cNvGraphicFramePr>
               <a:graphicFrameLocks xmlns:a="http://schemas.openxmlformats.org/drawingml/2006/main" noChangeAspect="1"/>
             </wp:cNvGraphicFramePr>
@@ -5527,7 +5527,7 @@
           <wp:inline distT="0" distB="0" distL="0" distR="0">
             <wp:extent cx="5029200" cy="3095625"/>
             <wp:effectExtent t="0" r="0" b="0" l="0"/>
-            <wp:docPr id="1" name="fig16_dateien.png" descr="Abbildung 16: Übersicht der Logger-Dateien (RAW, PAR, LOG)." title="Abbildung 16: Übersicht der Logger-Dateien (RAW, PAR, LOG)."/>
+            <wp:docPr id="1" name="fig16_dateien.png" descr="Figure 16: Overview of logger files (RAW, PAR, LOG)." title="Figure 16: Overview of logger files (RAW, PAR, LOG)."/>
             <wp:cNvGraphicFramePr>
               <a:graphicFrameLocks xmlns:a="http://schemas.openxmlformats.org/drawingml/2006/main" noChangeAspect="1"/>
             </wp:cNvGraphicFramePr>
@@ -5804,7 +5804,7 @@
           <wp:inline distT="0" distB="0" distL="0" distR="0">
             <wp:extent cx="5029200" cy="2809875"/>
             <wp:effectExtent t="0" r="0" b="0" l="0"/>
-            <wp:docPr id="1" name="fig17_karte.png" descr="Abbildung 17: Karte mit Loggerauswahl und rechts eingeblendeter Messhistorie." title="Abbildung 17: Karte mit Loggerauswahl und rechts eingeblendeter Messhistorie."/>
+            <wp:docPr id="1" name="fig17_karte.png" descr="Figure 17: Map with logger selection and measurement history shown on the right." title="Figure 17: Map with logger selection and measurement history shown on the right."/>
             <wp:cNvGraphicFramePr>
               <a:graphicFrameLocks xmlns:a="http://schemas.openxmlformats.org/drawingml/2006/main" noChangeAspect="1"/>
             </wp:cNvGraphicFramePr>
@@ -5962,7 +5962,7 @@
           <wp:inline distT="0" distB="0" distL="0" distR="0">
             <wp:extent cx="5029200" cy="3524250"/>
             <wp:effectExtent t="0" r="0" b="0" l="0"/>
-            <wp:docPr id="1" name="fig18_buergerportal.png" descr="Abbildung 18: Bürgerportal mit öffentlich einsehbaren Messstellen." title="Abbildung 18: Bürgerportal mit öffentlich einsehbaren Messstellen."/>
+            <wp:docPr id="1" name="fig18_buergerportal.png" descr="Figure 18: Citizen portal with publicly visible measuring points." title="Figure 18: Citizen portal with publicly visible measuring points."/>
             <wp:cNvGraphicFramePr>
               <a:graphicFrameLocks xmlns:a="http://schemas.openxmlformats.org/drawingml/2006/main" noChangeAspect="1"/>
             </wp:cNvGraphicFramePr>
@@ -6120,7 +6120,7 @@
           <wp:inline distT="0" distB="0" distL="0" distR="0">
             <wp:extent cx="5029200" cy="2352675"/>
             <wp:effectExtent t="0" r="0" b="0" l="0"/>
-            <wp:docPr id="1" name="fig19_alarm.png" descr="Abbildung 19: Übersicht des Alarm-Managements mit Alarmgruppen (links) und Alarmen (rechts)." title="Abbildung 19: Übersicht des Alarm-Managements mit Alarmgruppen (links) und Alarmen (rechts)."/>
+            <wp:docPr id="1" name="fig19_alarm.png" descr="Figure 19: Alarm-management overview with alarm groups (left) and alarms (right)." title="Figure 19: Alarm-management overview with alarm groups (left) and alarms (right)."/>
             <wp:cNvGraphicFramePr>
               <a:graphicFrameLocks xmlns:a="http://schemas.openxmlformats.org/drawingml/2006/main" noChangeAspect="1"/>
             </wp:cNvGraphicFramePr>
@@ -6447,7 +6447,7 @@
           <wp:inline distT="0" distB="0" distL="0" distR="0">
             <wp:extent cx="5029200" cy="2562225"/>
             <wp:effectExtent t="0" r="0" b="0" l="0"/>
-            <wp:docPr id="1" name="fig20_alarm_config.png" descr="Abbildung 20: Alarm konfigurieren – Sensor-Überwachung mit Min/Max-Werten." title="Abbildung 20: Alarm konfigurieren – Sensor-Überwachung mit Min/Max-Werten."/>
+            <wp:docPr id="1" name="fig20_alarm_config.png" descr="Figure 20: Configuring an alarm – sensor monitoring with min/max values." title="Figure 20: Configuring an alarm – sensor monitoring with min/max values."/>
             <wp:cNvGraphicFramePr>
               <a:graphicFrameLocks xmlns:a="http://schemas.openxmlformats.org/drawingml/2006/main" noChangeAspect="1"/>
             </wp:cNvGraphicFramePr>
@@ -6804,7 +6804,7 @@
           <wp:inline distT="0" distB="0" distL="0" distR="0">
             <wp:extent cx="4114800" cy="1971675"/>
             <wp:effectExtent t="0" r="0" b="0" l="0"/>
-            <wp:docPr id="1" name="fig21_sms.png" descr="Abbildung 21: SMS-Benachrichtigung – Empfänger und Nachrichtenvorlage." title="Abbildung 21: SMS-Benachrichtigung – Empfänger und Nachrichtenvorlage."/>
+            <wp:docPr id="1" name="fig21_sms.png" descr="Figure 21: SMS notification – recipient and message template." title="Figure 21: SMS notification – recipient and message template."/>
             <wp:cNvGraphicFramePr>
               <a:graphicFrameLocks xmlns:a="http://schemas.openxmlformats.org/drawingml/2006/main" noChangeAspect="1"/>
             </wp:cNvGraphicFramePr>
@@ -7052,7 +7052,7 @@
           <wp:inline distT="0" distB="0" distL="0" distR="0">
             <wp:extent cx="3657600" cy="3495675"/>
             <wp:effectExtent t="0" r="0" b="0" l="0"/>
-            <wp:docPr id="1" name="fig22_verwaltung.png" descr="Abbildung 22: Einstiegspunkt der Benutzer-, Gruppen- und Loggerverwaltung." title="Abbildung 22: Einstiegspunkt der Benutzer-, Gruppen- und Loggerverwaltung."/>
+            <wp:docPr id="1" name="fig22_verwaltung.png" descr="Figure 22: Entry point of user, group and logger administration." title="Figure 22: Entry point of user, group and logger administration."/>
             <wp:cNvGraphicFramePr>
               <a:graphicFrameLocks xmlns:a="http://schemas.openxmlformats.org/drawingml/2006/main" noChangeAspect="1"/>
             </wp:cNvGraphicFramePr>
@@ -7275,7 +7275,7 @@
           <wp:inline distT="0" distB="0" distL="0" distR="0">
             <wp:extent cx="3838575" cy="4105275"/>
             <wp:effectExtent t="0" r="0" b="0" l="0"/>
-            <wp:docPr id="1" name="fig23_gruppen.png" descr="Abbildung 23: Dialog zum Anlegen einer neuen Gruppe." title="Abbildung 23: Dialog zum Anlegen einer neuen Gruppe."/>
+            <wp:docPr id="1" name="fig23_gruppen.png" descr="Figure 23: Dialogue for creating a new group." title="Figure 23: Dialogue for creating a new group."/>
             <wp:cNvGraphicFramePr>
               <a:graphicFrameLocks xmlns:a="http://schemas.openxmlformats.org/drawingml/2006/main" noChangeAspect="1"/>
             </wp:cNvGraphicFramePr>
@@ -7494,7 +7494,7 @@
           <wp:inline distT="0" distB="0" distL="0" distR="0">
             <wp:extent cx="4114800" cy="3000375"/>
             <wp:effectExtent t="0" r="0" b="0" l="0"/>
-            <wp:docPr id="1" name="fig24_benutzer.png" descr="Abbildung 24: Benutzer anlegen – Pflichtfelder sind mit rotem Stern markiert." title="Abbildung 24: Benutzer anlegen – Pflichtfelder sind mit rotem Stern markiert."/>
+            <wp:docPr id="1" name="fig24_benutzer.png" descr="Figure 24: Creating a user – mandatory fields are marked with a red asterisk." title="Figure 24: Creating a user – mandatory fields are marked with a red asterisk."/>
             <wp:cNvGraphicFramePr>
               <a:graphicFrameLocks xmlns:a="http://schemas.openxmlformats.org/drawingml/2006/main" noChangeAspect="1"/>
             </wp:cNvGraphicFramePr>
@@ -8193,7 +8193,7 @@
           <wp:inline distT="0" distB="0" distL="0" distR="0">
             <wp:extent cx="5029200" cy="3848100"/>
             <wp:effectExtent t="0" r="0" b="0" l="0"/>
-            <wp:docPr id="1" name="fig25_logger_neu.png" descr="Abbildung 25: Dialog zum Anlegen neuer Logger." title="Abbildung 25: Dialog zum Anlegen neuer Logger."/>
+            <wp:docPr id="1" name="fig25_logger_neu.png" descr="Figure 25: Dialogue for creating new loggers." title="Figure 25: Dialogue for creating new loggers."/>
             <wp:cNvGraphicFramePr>
               <a:graphicFrameLocks xmlns:a="http://schemas.openxmlformats.org/drawingml/2006/main" noChangeAspect="1"/>
             </wp:cNvGraphicFramePr>
@@ -8467,7 +8467,7 @@
           <wp:inline distT="0" distB="0" distL="0" distR="0">
             <wp:extent cx="4114800" cy="2781300"/>
             <wp:effectExtent t="0" r="0" b="0" l="0"/>
-            <wp:docPr id="1" name="fig26_sensor_config.png" descr="Abbildung 26: Sensor-Konfiguration für einen benutzerdefinierten Logger." title="Abbildung 26: Sensor-Konfiguration für einen benutzerdefinierten Logger."/>
+            <wp:docPr id="1" name="fig26_sensor_config.png" descr="Figure 26: Sensor configuration for a custom logger." title="Figure 26: Sensor configuration for a custom logger."/>
             <wp:cNvGraphicFramePr>
               <a:graphicFrameLocks xmlns:a="http://schemas.openxmlformats.org/drawingml/2006/main" noChangeAspect="1"/>
             </wp:cNvGraphicFramePr>
@@ -8701,7 +8701,7 @@
           <wp:inline distT="0" distB="0" distL="0" distR="0">
             <wp:extent cx="5029200" cy="1828800"/>
             <wp:effectExtent t="0" r="0" b="0" l="0"/>
-            <wp:docPr id="1" name="fig28_sensor_ext.png" descr="Abbildung 27: Erweiterte Sensoreigenschaften – Umrechnung, Additionskonstante und Schwellen." title="Abbildung 27: Erweiterte Sensoreigenschaften – Umrechnung, Additionskonstante und Schwellen."/>
+            <wp:docPr id="1" name="fig28_sensor_ext.png" descr="Figure 27: Extended sensor properties – conversion, addition constant and thresholds." title="Figure 27: Extended sensor properties – conversion, addition constant and thresholds."/>
             <wp:cNvGraphicFramePr>
               <a:graphicFrameLocks xmlns:a="http://schemas.openxmlformats.org/drawingml/2006/main" noChangeAspect="1"/>
             </wp:cNvGraphicFramePr>
@@ -8893,7 +8893,7 @@
           <wp:inline distT="0" distB="0" distL="0" distR="0">
             <wp:extent cx="4114800" cy="3381375"/>
             <wp:effectExtent t="0" r="0" b="0" l="0"/>
-            <wp:docPr id="1" name="fig27_logger_bearb.png" descr="Abbildung 28: Logger bearbeiten – Sensorliste mit Bearbeiten/Hinzufügen/Löschen." title="Abbildung 28: Logger bearbeiten – Sensorliste mit Bearbeiten/Hinzufügen/Löschen."/>
+            <wp:docPr id="1" name="fig27_logger_bearb.png" descr="Figure 28: Editing a logger – sensor list with Edit / Add / Delete." title="Figure 28: Editing a logger – sensor list with Edit / Add / Delete."/>
             <wp:cNvGraphicFramePr>
               <a:graphicFrameLocks xmlns:a="http://schemas.openxmlformats.org/drawingml/2006/main" noChangeAspect="1"/>
             </wp:cNvGraphicFramePr>
@@ -9105,7 +9105,7 @@
           <wp:inline distT="0" distB="0" distL="0" distR="0">
             <wp:extent cx="2924175" cy="2305050"/>
             <wp:effectExtent t="0" r="0" b="0" l="0"/>
-            <wp:docPr id="1" name="fig29_logger_del.png" descr="Abbildung 29: Löschen-Dialog mit Bestätigungs-Auswahlbox." title="Abbildung 29: Löschen-Dialog mit Bestätigungs-Auswahlbox."/>
+            <wp:docPr id="1" name="fig29_logger_del.png" descr="Figure 29: Delete dialogue with a confirmation checkbox." title="Figure 29: Delete dialogue with a confirmation checkbox."/>
             <wp:cNvGraphicFramePr>
               <a:graphicFrameLocks xmlns:a="http://schemas.openxmlformats.org/drawingml/2006/main" noChangeAspect="1"/>
             </wp:cNvGraphicFramePr>
@@ -9331,7 +9331,7 @@
           <wp:inline distT="0" distB="0" distL="0" distR="0">
             <wp:extent cx="2743200" cy="3562350"/>
             <wp:effectExtent t="0" r="0" b="0" l="0"/>
-            <wp:docPr id="1" name="fig30_koordinaten.png" descr="Abbildung 30: Koordinatendialog mit optionaler Transformation." title="Abbildung 30: Koordinatendialog mit optionaler Transformation."/>
+            <wp:docPr id="1" name="fig30_koordinaten.png" descr="Figure 30: Coordinates dialogue with optional transformation." title="Figure 30: Coordinates dialogue with optional transformation."/>
             <wp:cNvGraphicFramePr>
               <a:graphicFrameLocks xmlns:a="http://schemas.openxmlformats.org/drawingml/2006/main" noChangeAspect="1"/>
             </wp:cNvGraphicFramePr>
@@ -9601,7 +9601,7 @@
           <wp:inline distT="0" distB="0" distL="0" distR="0">
             <wp:extent cx="2924175" cy="2600325"/>
             <wp:effectExtent t="0" r="0" b="0" l="0"/>
-            <wp:docPr id="1" name="fig31_messstellen.png" descr="Abbildung 31: Messstellen-Konfiguration mit Optionen für neue und alte Messstelle." title="Abbildung 31: Messstellen-Konfiguration mit Optionen für neue und alte Messstelle."/>
+            <wp:docPr id="1" name="fig31_messstellen.png" descr="Figure 31: Measuring-point configuration with options for new and old measuring points." title="Figure 31: Measuring-point configuration with options for new and old measuring points."/>
             <wp:cNvGraphicFramePr>
               <a:graphicFrameLocks xmlns:a="http://schemas.openxmlformats.org/drawingml/2006/main" noChangeAspect="1"/>
             </wp:cNvGraphicFramePr>
@@ -9909,7 +9909,7 @@
           <wp:inline distT="0" distB="0" distL="0" distR="0">
             <wp:extent cx="5029200" cy="4105275"/>
             <wp:effectExtent t="0" r="0" b="0" l="0"/>
-            <wp:docPr id="1" name="fig32_autoexport.png" descr="Abbildung 32: Konfiguration eines automatischen Exports." title="Abbildung 32: Konfiguration eines automatischen Exports."/>
+            <wp:docPr id="1" name="fig32_autoexport.png" descr="Figure 32: Configuration of an automatic export." title="Figure 32: Configuration of an automatic export."/>
             <wp:cNvGraphicFramePr>
               <a:graphicFrameLocks xmlns:a="http://schemas.openxmlformats.org/drawingml/2006/main" noChangeAspect="1"/>
             </wp:cNvGraphicFramePr>
@@ -10578,7 +10578,7 @@
           <wp:inline distT="0" distB="0" distL="0" distR="0">
             <wp:extent cx="5029200" cy="3781425"/>
             <wp:effectExtent t="0" r="0" b="0" l="0"/>
-            <wp:docPr id="1" name="fig33_gruppenexport.png" descr="Abbildung 33: Gruppen-Export mit ausgewählten Sensoren und Zeitraum." title="Abbildung 33: Gruppen-Export mit ausgewählten Sensoren und Zeitraum."/>
+            <wp:docPr id="1" name="fig33_gruppenexport.png" descr="Figure 33: Group export with selected sensors and time range." title="Figure 33: Group export with selected sensors and time range."/>
             <wp:cNvGraphicFramePr>
               <a:graphicFrameLocks xmlns:a="http://schemas.openxmlformats.org/drawingml/2006/main" noChangeAspect="1"/>
             </wp:cNvGraphicFramePr>
@@ -10705,7 +10705,7 @@
           <wp:inline distT="0" distB="0" distL="0" distR="0">
             <wp:extent cx="5029200" cy="2943225"/>
             <wp:effectExtent t="0" r="0" b="0" l="0"/>
-            <wp:docPr id="1" name="fig34_isolinien.png" descr="Abbildung 34: Isolinien-Karte mit Konfigurationsliste und Werkzeugen." title="Abbildung 34: Isolinien-Karte mit Konfigurationsliste und Werkzeugen."/>
+            <wp:docPr id="1" name="fig34_isolinien.png" descr="Figure 34: Isoline map with configuration list and tools." title="Figure 34: Isoline map with configuration list and tools."/>
             <wp:cNvGraphicFramePr>
               <a:graphicFrameLocks xmlns:a="http://schemas.openxmlformats.org/drawingml/2006/main" noChangeAspect="1"/>
             </wp:cNvGraphicFramePr>
@@ -10963,7 +10963,7 @@
           <wp:inline distT="0" distB="0" distL="0" distR="0">
             <wp:extent cx="2743200" cy="1885950"/>
             <wp:effectExtent t="0" r="0" b="0" l="0"/>
-            <wp:docPr id="1" name="fig35_iso_modus.png" descr="Abbildung 35: Konfigurationsbereich für Isolinien mit Modus und Sensorauswahl." title="Abbildung 35: Konfigurationsbereich für Isolinien mit Modus und Sensorauswahl."/>
+            <wp:docPr id="1" name="fig35_iso_modus.png" descr="Figure 35: Isoline configuration area with mode and sensor selection." title="Figure 35: Isoline configuration area with mode and sensor selection."/>
             <wp:cNvGraphicFramePr>
               <a:graphicFrameLocks xmlns:a="http://schemas.openxmlformats.org/drawingml/2006/main" noChangeAspect="1"/>
             </wp:cNvGraphicFramePr>

</xml_diff>